<commit_message>
Standardize branded document typography
</commit_message>
<xml_diff>
--- a/templates/annex/aneks-kontrate.docx
+++ b/templates/annex/aneks-kontrate.docx
@@ -8,7 +8,7 @@
       </w:pPr>
       <w:r>
         <w:rPr>
-          <w:rFonts w:ascii="Calibri" w:cs="Calibri" w:eastAsia="Calibri" w:hAnsi="Calibri"/>
+          <w:rFonts w:ascii="Liberation Sans" w:cs="Liberation Sans" w:eastAsia="Liberation Sans" w:hAnsi="Liberation Sans"/>
           <w:b/>
           <w:bCs/>
           <w:sz w:val="30"/>
@@ -23,7 +23,7 @@
       </w:pPr>
       <w:r>
         <w:rPr>
-          <w:rFonts w:ascii="Calibri" w:cs="Calibri" w:eastAsia="Calibri" w:hAnsi="Calibri"/>
+          <w:rFonts w:ascii="Liberation Serif" w:cs="Liberation Serif" w:eastAsia="Liberation Serif" w:hAnsi="Liberation Serif"/>
           <w:sz w:val="18"/>
           <w:szCs w:val="18"/>
         </w:rPr>
@@ -37,7 +37,7 @@
       </w:pPr>
       <w:r>
         <w:rPr>
-          <w:rFonts w:ascii="Calibri" w:cs="Calibri" w:eastAsia="Calibri" w:hAnsi="Calibri"/>
+          <w:rFonts w:ascii="Liberation Sans" w:cs="Liberation Sans" w:eastAsia="Liberation Sans" w:hAnsi="Liberation Sans"/>
           <w:b/>
           <w:bCs/>
           <w:sz w:val="28"/>
@@ -52,7 +52,7 @@
       </w:pPr>
       <w:r>
         <w:rPr>
-          <w:rFonts w:ascii="Calibri" w:cs="Calibri" w:eastAsia="Calibri" w:hAnsi="Calibri"/>
+          <w:rFonts w:ascii="Liberation Serif" w:cs="Liberation Serif" w:eastAsia="Liberation Serif" w:hAnsi="Liberation Serif"/>
         </w:rPr>
         <w:t xml:space="preserve">Në bazë të neneve 10, 11, 17, 18 dhe 19 të Ligjit Nr. 03/L-212 të Punës, si dhe Kontratës së Punës të lidhur me datën {{original_contract_date}}, palët nënshkruese lidhin këtë aneks të kontratës së punës:</w:t>
       </w:r>
@@ -63,7 +63,7 @@
       </w:pPr>
       <w:r>
         <w:rPr>
-          <w:rFonts w:ascii="Calibri" w:cs="Calibri" w:eastAsia="Calibri" w:hAnsi="Calibri"/>
+          <w:rFonts w:ascii="Liberation Serif" w:cs="Liberation Serif" w:eastAsia="Liberation Serif" w:hAnsi="Liberation Serif"/>
         </w:rPr>
         <w:t xml:space="preserve">1. Punëdhënësi: {{company_name}}, me seli në {{company_address}}, numri i biznesit {{company_nrb}}, i përfaqësuar nga {{authorized_person_name}} ({{authorized_person_position}}); dhe</w:t>
       </w:r>
@@ -74,7 +74,7 @@
       </w:pPr>
       <w:r>
         <w:rPr>
-          <w:rFonts w:ascii="Calibri" w:cs="Calibri" w:eastAsia="Calibri" w:hAnsi="Calibri"/>
+          <w:rFonts w:ascii="Liberation Serif" w:cs="Liberation Serif" w:eastAsia="Liberation Serif" w:hAnsi="Liberation Serif"/>
         </w:rPr>
         <w:t xml:space="preserve">2. I punësuari: {{employee_name}}, numri personal {{employee_personal_number}}, me vendbanim {{employee_address}}.</w:t>
       </w:r>
@@ -85,7 +85,7 @@
       </w:pPr>
       <w:r>
         <w:rPr>
-          <w:rFonts w:ascii="Calibri" w:cs="Calibri" w:eastAsia="Calibri" w:hAnsi="Calibri"/>
+          <w:rFonts w:ascii="Liberation Sans" w:cs="Liberation Sans" w:eastAsia="Liberation Sans" w:hAnsi="Liberation Sans"/>
           <w:b/>
           <w:bCs/>
         </w:rPr>
@@ -98,7 +98,7 @@
       </w:pPr>
       <w:r>
         <w:rPr>
-          <w:rFonts w:ascii="Calibri" w:cs="Calibri" w:eastAsia="Calibri" w:hAnsi="Calibri"/>
+          <w:rFonts w:ascii="Liberation Serif" w:cs="Liberation Serif" w:eastAsia="Liberation Serif" w:hAnsi="Liberation Serif"/>
         </w:rPr>
         <w:t xml:space="preserve">Me këtë aneks, palët pajtohen që kushtet e kontratës së punës të ndryshohen si në vijim:</w:t>
       </w:r>
@@ -109,7 +109,7 @@
       </w:pPr>
       <w:r>
         <w:rPr>
-          <w:rFonts w:ascii="Calibri" w:cs="Calibri" w:eastAsia="Calibri" w:hAnsi="Calibri"/>
+          <w:rFonts w:ascii="Liberation Serif" w:cs="Liberation Serif" w:eastAsia="Liberation Serif" w:hAnsi="Liberation Serif"/>
         </w:rPr>
         <w:t xml:space="preserve">{{#changes}}</w:t>
       </w:r>
@@ -120,7 +120,7 @@
       </w:pPr>
       <w:r>
         <w:rPr>
-          <w:rFonts w:ascii="Calibri" w:cs="Calibri" w:eastAsia="Calibri" w:hAnsi="Calibri"/>
+          <w:rFonts w:ascii="Liberation Serif" w:cs="Liberation Serif" w:eastAsia="Liberation Serif" w:hAnsi="Liberation Serif"/>
         </w:rPr>
         <w:t xml:space="preserve">•  {{label}}: nga “{{from}}” në “{{to}}”.</w:t>
       </w:r>
@@ -131,7 +131,7 @@
       </w:pPr>
       <w:r>
         <w:rPr>
-          <w:rFonts w:ascii="Calibri" w:cs="Calibri" w:eastAsia="Calibri" w:hAnsi="Calibri"/>
+          <w:rFonts w:ascii="Liberation Serif" w:cs="Liberation Serif" w:eastAsia="Liberation Serif" w:hAnsi="Liberation Serif"/>
         </w:rPr>
         <w:t xml:space="preserve">{{/changes}}</w:t>
       </w:r>
@@ -142,7 +142,7 @@
       </w:pPr>
       <w:r>
         <w:rPr>
-          <w:rFonts w:ascii="Calibri" w:cs="Calibri" w:eastAsia="Calibri" w:hAnsi="Calibri"/>
+          <w:rFonts w:ascii="Liberation Sans" w:cs="Liberation Sans" w:eastAsia="Liberation Sans" w:hAnsi="Liberation Sans"/>
           <w:b/>
           <w:bCs/>
         </w:rPr>
@@ -155,7 +155,7 @@
       </w:pPr>
       <w:r>
         <w:rPr>
-          <w:rFonts w:ascii="Calibri" w:cs="Calibri" w:eastAsia="Calibri" w:hAnsi="Calibri"/>
+          <w:rFonts w:ascii="Liberation Serif" w:cs="Liberation Serif" w:eastAsia="Liberation Serif" w:hAnsi="Liberation Serif"/>
         </w:rPr>
         <w:t xml:space="preserve">Ndryshimet e përcaktuara me këtë aneks hyjnë në fuqi nga data {{annex_effective_date}}.</w:t>
       </w:r>
@@ -166,7 +166,7 @@
       </w:pPr>
       <w:r>
         <w:rPr>
-          <w:rFonts w:ascii="Calibri" w:cs="Calibri" w:eastAsia="Calibri" w:hAnsi="Calibri"/>
+          <w:rFonts w:ascii="Liberation Sans" w:cs="Liberation Sans" w:eastAsia="Liberation Sans" w:hAnsi="Liberation Sans"/>
           <w:b/>
           <w:bCs/>
         </w:rPr>
@@ -179,7 +179,7 @@
       </w:pPr>
       <w:r>
         <w:rPr>
-          <w:rFonts w:ascii="Calibri" w:cs="Calibri" w:eastAsia="Calibri" w:hAnsi="Calibri"/>
+          <w:rFonts w:ascii="Liberation Serif" w:cs="Liberation Serif" w:eastAsia="Liberation Serif" w:hAnsi="Liberation Serif"/>
         </w:rPr>
         <w:t xml:space="preserve">Të gjitha dispozitat e tjera të kontratës së punës të datës {{original_contract_date}} mbeten të pandryshuara dhe në fuqi. Ky aneks është pjesë përbërëse e kontratës së punës dhe përpilohet në dy (2) kopje, nga një për secilën palë.</w:t>
       </w:r>
@@ -190,7 +190,7 @@
       </w:pPr>
       <w:r>
         <w:rPr>
-          <w:rFonts w:ascii="Calibri" w:cs="Calibri" w:eastAsia="Calibri" w:hAnsi="Calibri"/>
+          <w:rFonts w:ascii="Liberation Serif" w:cs="Liberation Serif" w:eastAsia="Liberation Serif" w:hAnsi="Liberation Serif"/>
         </w:rPr>
         <w:t xml:space="preserve">{{document_place}}, më {{document_date}}</w:t>
       </w:r>
@@ -223,7 +223,7 @@
             </w:pPr>
             <w:r>
               <w:rPr>
-                <w:rFonts w:ascii="Calibri" w:cs="Calibri" w:eastAsia="Calibri" w:hAnsi="Calibri"/>
+                <w:rFonts w:ascii="Liberation Serif" w:cs="Liberation Serif" w:eastAsia="Liberation Serif" w:hAnsi="Liberation Serif"/>
                 <w:b/>
                 <w:bCs/>
               </w:rPr>
@@ -242,7 +242,7 @@
             </w:pPr>
             <w:r>
               <w:rPr>
-                <w:rFonts w:ascii="Calibri" w:cs="Calibri" w:eastAsia="Calibri" w:hAnsi="Calibri"/>
+                <w:rFonts w:ascii="Liberation Serif" w:cs="Liberation Serif" w:eastAsia="Liberation Serif" w:hAnsi="Liberation Serif"/>
                 <w:b/>
                 <w:bCs/>
               </w:rPr>
@@ -263,7 +263,7 @@
             </w:pPr>
             <w:r>
               <w:rPr>
-                <w:rFonts w:ascii="Calibri" w:cs="Calibri" w:eastAsia="Calibri" w:hAnsi="Calibri"/>
+                <w:rFonts w:ascii="Liberation Serif" w:cs="Liberation Serif" w:eastAsia="Liberation Serif" w:hAnsi="Liberation Serif"/>
               </w:rPr>
               <w:t xml:space="preserve">________________________</w:t>
             </w:r>
@@ -280,7 +280,7 @@
             </w:pPr>
             <w:r>
               <w:rPr>
-                <w:rFonts w:ascii="Calibri" w:cs="Calibri" w:eastAsia="Calibri" w:hAnsi="Calibri"/>
+                <w:rFonts w:ascii="Liberation Serif" w:cs="Liberation Serif" w:eastAsia="Liberation Serif" w:hAnsi="Liberation Serif"/>
               </w:rPr>
               <w:t xml:space="preserve">________________________</w:t>
             </w:r>
@@ -299,7 +299,7 @@
             </w:pPr>
             <w:r>
               <w:rPr>
-                <w:rFonts w:ascii="Calibri" w:cs="Calibri" w:eastAsia="Calibri" w:hAnsi="Calibri"/>
+                <w:rFonts w:ascii="Liberation Serif" w:cs="Liberation Serif" w:eastAsia="Liberation Serif" w:hAnsi="Liberation Serif"/>
               </w:rPr>
               <w:t xml:space="preserve">{{authorized_person_name}}</w:t>
             </w:r>
@@ -316,7 +316,7 @@
             </w:pPr>
             <w:r>
               <w:rPr>
-                <w:rFonts w:ascii="Calibri" w:cs="Calibri" w:eastAsia="Calibri" w:hAnsi="Calibri"/>
+                <w:rFonts w:ascii="Liberation Serif" w:cs="Liberation Serif" w:eastAsia="Liberation Serif" w:hAnsi="Liberation Serif"/>
               </w:rPr>
               <w:t xml:space="preserve">{{employee_name}}</w:t>
             </w:r>
@@ -512,7 +512,7 @@
   <w:docDefaults>
     <w:rPrDefault>
       <w:rPr>
-        <w:rFonts w:ascii="Calibri" w:cs="Calibri" w:eastAsia="Calibri" w:hAnsi="Calibri"/>
+        <w:rFonts w:ascii="Liberation Serif" w:cs="Liberation Serif" w:eastAsia="Liberation Serif" w:hAnsi="Liberation Serif"/>
         <w:sz w:val="22"/>
         <w:szCs w:val="22"/>
       </w:rPr>
@@ -525,6 +525,7 @@
     <w:next w:val="Normal"/>
     <w:qFormat/>
     <w:rPr>
+      <w:rFonts w:ascii="Liberation Sans" w:hAnsi="Liberation Sans" w:eastAsia="Liberation Sans" w:cs="Liberation Sans"/>
       <w:sz w:val="56"/>
       <w:szCs w:val="56"/>
     </w:rPr>
@@ -535,6 +536,7 @@
     <w:next w:val="Normal"/>
     <w:qFormat/>
     <w:rPr>
+      <w:rFonts w:ascii="Liberation Sans" w:hAnsi="Liberation Sans" w:eastAsia="Liberation Sans" w:cs="Liberation Sans"/>
       <w:color w:val="2E74B5"/>
       <w:sz w:val="32"/>
       <w:szCs w:val="32"/>
@@ -546,6 +548,7 @@
     <w:next w:val="Normal"/>
     <w:qFormat/>
     <w:rPr>
+      <w:rFonts w:ascii="Liberation Sans" w:hAnsi="Liberation Sans" w:eastAsia="Liberation Sans" w:cs="Liberation Sans"/>
       <w:color w:val="2E74B5"/>
       <w:sz w:val="26"/>
       <w:szCs w:val="26"/>
@@ -557,6 +560,7 @@
     <w:next w:val="Normal"/>
     <w:qFormat/>
     <w:rPr>
+      <w:rFonts w:ascii="Liberation Sans" w:hAnsi="Liberation Sans" w:eastAsia="Liberation Sans" w:cs="Liberation Sans"/>
       <w:color w:val="1F4D78"/>
       <w:sz w:val="24"/>
       <w:szCs w:val="24"/>
@@ -568,6 +572,7 @@
     <w:next w:val="Normal"/>
     <w:qFormat/>
     <w:rPr>
+      <w:rFonts w:ascii="Liberation Sans" w:hAnsi="Liberation Sans" w:eastAsia="Liberation Sans" w:cs="Liberation Sans"/>
       <w:i/>
       <w:iCs/>
       <w:color w:val="2E74B5"/>
@@ -579,6 +584,7 @@
     <w:next w:val="Normal"/>
     <w:qFormat/>
     <w:rPr>
+      <w:rFonts w:ascii="Liberation Sans" w:hAnsi="Liberation Sans" w:eastAsia="Liberation Sans" w:cs="Liberation Sans"/>
       <w:color w:val="2E74B5"/>
     </w:rPr>
   </w:style>
@@ -588,6 +594,7 @@
     <w:next w:val="Normal"/>
     <w:qFormat/>
     <w:rPr>
+      <w:rFonts w:ascii="Liberation Sans" w:hAnsi="Liberation Sans" w:eastAsia="Liberation Sans" w:cs="Liberation Sans"/>
       <w:color w:val="1F4D78"/>
     </w:rPr>
   </w:style>
@@ -597,6 +604,7 @@
     <w:next w:val="Normal"/>
     <w:qFormat/>
     <w:rPr>
+      <w:rFonts w:ascii="Liberation Serif" w:hAnsi="Liberation Serif" w:eastAsia="Liberation Serif" w:cs="Liberation Serif"/>
       <w:b/>
       <w:bCs/>
     </w:rPr>
@@ -605,6 +613,9 @@
     <w:name w:val="List Paragraph"/>
     <w:basedOn w:val="Normal"/>
     <w:qFormat/>
+    <w:rPr>
+      <w:rFonts w:ascii="Liberation Serif" w:hAnsi="Liberation Serif" w:eastAsia="Liberation Serif" w:cs="Liberation Serif"/>
+    </w:rPr>
   </w:style>
   <w:style w:type="character" w:styleId="Hyperlink">
     <w:name w:val="Hyperlink"/>
@@ -612,6 +623,7 @@
     <w:uiPriority w:val="99"/>
     <w:unhideWhenUsed/>
     <w:rPr>
+      <w:rFonts w:ascii="Liberation Serif" w:hAnsi="Liberation Serif" w:eastAsia="Liberation Serif" w:cs="Liberation Serif"/>
       <w:color w:val="0563C1"/>
       <w:u w:val="single"/>
     </w:rPr>
@@ -623,6 +635,7 @@
     <w:semiHidden/>
     <w:unhideWhenUsed/>
     <w:rPr>
+      <w:rFonts w:ascii="Liberation Serif" w:hAnsi="Liberation Serif" w:eastAsia="Liberation Serif" w:cs="Liberation Serif"/>
       <w:vertAlign w:val="superscript"/>
     </w:rPr>
   </w:style>
@@ -637,6 +650,7 @@
       <w:spacing w:after="0" w:line="240" w:lineRule="auto"/>
     </w:pPr>
     <w:rPr>
+      <w:rFonts w:ascii="Liberation Serif" w:hAnsi="Liberation Serif" w:eastAsia="Liberation Serif" w:cs="Liberation Serif"/>
       <w:sz w:val="20"/>
       <w:szCs w:val="20"/>
     </w:rPr>
@@ -649,6 +663,7 @@
     <w:semiHidden/>
     <w:unhideWhenUsed/>
     <w:rPr>
+      <w:rFonts w:ascii="Liberation Serif" w:hAnsi="Liberation Serif" w:eastAsia="Liberation Serif" w:cs="Liberation Serif"/>
       <w:sz w:val="20"/>
       <w:szCs w:val="20"/>
     </w:rPr>
@@ -660,6 +675,7 @@
     <w:semiHidden/>
     <w:unhideWhenUsed/>
     <w:rPr>
+      <w:rFonts w:ascii="Liberation Serif" w:hAnsi="Liberation Serif" w:eastAsia="Liberation Serif" w:cs="Liberation Serif"/>
       <w:vertAlign w:val="superscript"/>
     </w:rPr>
   </w:style>
@@ -674,6 +690,7 @@
       <w:spacing w:after="0" w:line="240" w:lineRule="auto"/>
     </w:pPr>
     <w:rPr>
+      <w:rFonts w:ascii="Liberation Serif" w:hAnsi="Liberation Serif" w:eastAsia="Liberation Serif" w:cs="Liberation Serif"/>
       <w:sz w:val="20"/>
       <w:szCs w:val="20"/>
     </w:rPr>
@@ -686,6 +703,7 @@
     <w:semiHidden/>
     <w:unhideWhenUsed/>
     <w:rPr>
+      <w:rFonts w:ascii="Liberation Serif" w:hAnsi="Liberation Serif" w:eastAsia="Liberation Serif" w:cs="Liberation Serif"/>
       <w:sz w:val="20"/>
       <w:szCs w:val="20"/>
     </w:rPr>

</xml_diff>